<commit_message>
flourishelc.com.au — fix all requirement issues in v2 doc
- Removed all em dash substitutes (128 ' -- ' instances replaced with commas/colons)
- Added Independence learning area to Page 3 (Vineyard)
- Expanded Page 6 (Riverstone) from 445 to 518 words
- Expanded Page 18 (Rossmoyne) from 446 to 527 words
- Replaced 'problem-solving' with warmer phrasing across 3 pages
- Fixed EYLF FAQ answer punctuation (Page 1)
- All 29 pages now pass: correct structure, 450-580 words, all 14 learning areas, EYLF + NQF, no em dashes, no negative vocabulary

Co-Authored-By: Claude Sonnet 4.6 <noreply@anthropic.com>
</commit_message>
<xml_diff>
--- a/clients/flourishelc.com.au/flourishelc.com.au_v2.docx
+++ b/clients/flourishelc.com.au/flourishelc.com.au_v2.docx
@@ -46,7 +46,7 @@
     </w:p>
     <w:p>
       <w:r>
-        <w:t>Flourish Early Learning Centre is a purpose-built childcare in Oakville designed around children thriving in every sense of the word. Guided by the Early Years Learning Framework (EYLF) -- Belonging, Being and Becoming -- our qualified educators bring genuine passion to every single day. Oakville families choose us because we go beyond care: we create a place where children light up, grow, and flourish.</w:t>
+        <w:t>Flourish Early Learning Centre is a purpose-built childcare in Oakville designed around children thriving in every sense of the word. Guided by the Early Years Learning Framework (EYLF): Belonging, Being and Becoming, our qualified educators bring genuine passion to every single day. Oakville families choose us because we go beyond care: we create a place where children light up, grow, and flourish.</w:t>
       </w:r>
     </w:p>
     <w:p>
@@ -59,7 +59,7 @@
     </w:p>
     <w:p>
       <w:r>
-        <w:t>Our programs span a rich range of learning areas that cover the whole child. Creative Arts, Music and Movement, STEM Learning, Language, Mathematics, and Fine Motor Skills are woven into daily experiences -- not as separate subjects, but as joyful, connected play. Cultural Understanding and Social Justice are part of our curriculum too, because we believe children flourish when they understand and celebrate the world around them.</w:t>
+        <w:t>Our programs span a rich range of learning areas that cover the whole child. Creative Arts, Music and Movement, STEM Learning, Language, Mathematics, and Fine Motor Skills are woven into daily experiences, woven together as joyful, connected play rather than separate subjects. Cultural Understanding and Social Justice are part of our curriculum too, because we believe children flourish when they understand and celebrate the world around them.</w:t>
         <w:br/>
         <w:br/>
         <w:t>We also serve five nutritious meals every day: breakfast, morning tea, lunch, afternoon tea, and a late snack. Our doors are open 7:00am to 6:00pm Monday to Friday, and our parent communication app keeps you connected with real-time updates throughout the day. School readiness programs mean your child transitions to kindergarten with confidence, curiosity, and a love of learning already in full bloom.</w:t>
@@ -75,10 +75,10 @@
     </w:p>
     <w:p>
       <w:r>
-        <w:t>The Flourish ELC environment is purpose-built -- every room, every outdoor space, and every learning corner has been thoughtfully designed for children aged 0 to 5. Our educators meet and exceed the National Quality Framework (NQF), bringing both professional excellence and genuine warmth to every interaction.</w:t>
+        <w:t>The Flourish ELC environment is purpose-built: every room, every outdoor space, and every learning corner has been thoughtfully designed for children aged 0 to 5. Our educators meet and exceed the National Quality Framework (NQF), bringing both professional excellence and genuine warmth to every interaction.</w:t>
         <w:br/>
         <w:br/>
-        <w:t>Exercise, Health, and Social and Emotional development are central to our daily rhythm. Children have space to move, rest, create, and connect. Independence is nurtured gently, with educators standing alongside children as they build confidence in their own abilities. The result is a community within a centre -- one that Oakville families feel proud to be part of.</w:t>
+        <w:t>Exercise, Health, and Social and Emotional development are central to our daily rhythm. Children have space to move, rest, create, and connect. Independence is nurtured gently, with educators standing alongside children as they build confidence in their own abilities. The result is a community within a centre, one that Oakville families feel proud to be part of.</w:t>
       </w:r>
     </w:p>
     <w:p>
@@ -151,7 +151,7 @@
     </w:p>
     <w:p>
       <w:r>
-        <w:t>The EYLF -- Belonging, Being and Becoming -- is the national framework that guides how we plan learning experiences. It places children's identity, wellbeing, and engagement at the heart of everything we do.</w:t>
+        <w:t>The EYLF (Belonging, Being and Becoming) is the national framework that guides how we plan learning experiences. It places children's identity, wellbeing, and engagement at the heart of everything we do.</w:t>
       </w:r>
     </w:p>
     <w:p>
@@ -203,7 +203,7 @@
     </w:p>
     <w:p>
       <w:r>
-        <w:t>Flourish Early Learning Centre is a warm, purpose-built early learning centre conveniently located for families in and around Box Hill. We are guided by the Early Years Learning Framework (EYLF) -- Belonging, Being and Becoming -- and our qualified, passionate educators bring that philosophy to life every single day. If you are looking for childcare near Box Hill that feels like a second home for your child, you have found it.</w:t>
+        <w:t>Flourish Early Learning Centre is a warm, purpose-built early learning centre conveniently located for families in and around Box Hill. We are guided by the Early Years Learning Framework (EYLF): Belonging, Being and Becoming, and our qualified, passionate educators bring that philosophy to life every single day. If you are looking for childcare near Box Hill that feels like a second home for your child, you have found it.</w:t>
       </w:r>
     </w:p>
     <w:p>
@@ -216,10 +216,10 @@
     </w:p>
     <w:p>
       <w:r>
-        <w:t>At Flourish ELC, learning is never one-dimensional. Our curriculum weaves together Creative Arts, STEM Learning, Language, Mathematics, Music and Movement, Fine Motor Skills, Cultural Understanding, Social Justice, Exercise, Health, Independence, and Social and Emotional development. These aren't boxes to tick -- they are the threads of a rich, joyful childhood.</w:t>
+        <w:t>At Flourish ELC, learning is never one-dimensional. Our curriculum weaves together Creative Arts, STEM Learning, Language, Mathematics, Music and Movement, Fine Motor Skills, Cultural Understanding, Social Justice, Exercise, Health, Independence, and Social and Emotional development. These aren't boxes to tick: they are the threads of a rich, joyful childhood.</w:t>
         <w:br/>
         <w:br/>
-        <w:t>Children learn by doing, by playing, by wondering, and by connecting with each other and their educators. Our school readiness programs make sure that when the time comes for kindergarten, children step through those gates feeling ready, capable, and excited. Five nutritious meals are prepared daily -- breakfast, morning tea, lunch, afternoon tea, and a late snack -- so children are always fuelled for discovery.</w:t>
+        <w:t>Children learn by doing, by playing, by wondering, and by connecting with each other and their educators. Our school readiness programs make sure that when the time comes for kindergarten, children step through those gates feeling ready, capable, and excited. Five nutritious meals are prepared daily: breakfast, morning tea, lunch, afternoon tea, and a late snack, so children are always fuelled for discovery.</w:t>
       </w:r>
     </w:p>
     <w:p>
@@ -232,7 +232,7 @@
     </w:p>
     <w:p>
       <w:r>
-        <w:t>Our purpose-built facility is designed with children in mind from the ground up. Every space -- from bright indoor classrooms to outdoor play areas -- has been crafted to inspire curiosity and support development. We meet and exceed the National Quality Framework (NQF), which means families can trust that our educators, programs, and environments are held to the highest national standards.</w:t>
+        <w:t>Our purpose-built facility is designed with children in mind from the ground up. Every space, from bright indoor classrooms to outdoor play areas, has been crafted to inspire curiosity and support development. We meet and exceed the National Quality Framework (NQF), which means families can trust that our educators, programs, and environments are held to the highest national standards.</w:t>
         <w:br/>
         <w:br/>
         <w:t>We are open 7:00am to 6:00pm Monday to Friday, and our parent communication app delivers real-time updates, photos, and milestone moments straight to your phone. The Flourish ELC community near Box Hill is one where children thrive and families feel genuinely supported.</w:t>
@@ -360,7 +360,7 @@
     </w:p>
     <w:p>
       <w:r>
-        <w:t>Flourish Early Learning Centre is a purpose-built early learning centre serving families in and around Vineyard. Built around the Early Years Learning Framework (EYLF) -- Belonging, Being and Becoming -- our centre is a place where children are celebrated for who they are, supported in what they're becoming, and given every opportunity to belong. Our qualified, passionate educators make Flourish ELC a truly special place for Vineyard families.</w:t>
+        <w:t>Flourish Early Learning Centre is a purpose-built early learning centre serving families in and around Vineyard. Built around the Early Years Learning Framework (EYLF): Belonging, Being and Becoming, our centre is a place where children are celebrated for who they are, supported in what they're becoming, and given every opportunity to belong. Our qualified, passionate educators make Flourish ELC a truly special place for Vineyard families.</w:t>
       </w:r>
     </w:p>
     <w:p>
@@ -376,7 +376,7 @@
         <w:t>Our curriculum at Flourish ELC covers the full spectrum of early childhood development. STEM Learning sparks curiosity about how the world works. Creative Arts and Music and Movement give children expressive outlets that build confidence. Language, Mathematics, and Fine Motor Skills lay the academic foundations that serve children well into their school years. Cultural Understanding, Social Justice, and Social and Emotional development nurture empathy, resilience, and a sense of self.</w:t>
         <w:br/>
         <w:br/>
-        <w:t>Exercise and Health are built into every day -- children move, play outdoors, and develop physical confidence alongside all the other wonderful things they are discovering. Five nutritious meals are served daily, from breakfast through to a late afternoon snack, so growing bodies are always well nourished.</w:t>
+        <w:t>Independence is woven into our daily rhythm too: educators stand alongside children as they build confidence in their own abilities, from choosing activities to navigating friendships. Exercise and Health are part of every day, so children move, play outdoors, and grow physically alongside everything else they are discovering. Five nutritious meals are served daily, from breakfast through to a late afternoon snack, so growing bodies are always well nourished.</w:t>
       </w:r>
     </w:p>
     <w:p>
@@ -389,7 +389,7 @@
     </w:p>
     <w:p>
       <w:r>
-        <w:t>Our facility has been designed from the ground up with children and families in mind. Meeting and exceeding the National Quality Framework (NQF) is not just a checkbox for us -- it is a commitment that runs through everything we do. Bright spaces, thoughtful outdoor areas, and warm, capable educators create an environment families near Vineyard trust completely.</w:t>
+        <w:t>Our facility has been designed from the ground up with children and families in mind. Meeting and exceeding the National Quality Framework (NQF) is not just a checkbox for us: it is a commitment that runs through everything we do. Bright spaces, thoughtful outdoor areas, and warm, capable educators create an environment families near Vineyard trust completely.</w:t>
         <w:br/>
         <w:br/>
         <w:t>We are open 7:00am to 6:00pm Monday to Friday. Our parent communication app keeps you genuinely connected with your child's day through real-time updates and photos. School readiness programs mean children transition to kindergarten with the skills and the heart to embrace what comes next.</w:t>
@@ -517,7 +517,7 @@
     </w:p>
     <w:p>
       <w:r>
-        <w:t>Flourish Early Learning Centre is a purpose-built childcare centre welcoming families in and around Gables. Everything here -- from the way our educators engage with children to the way our spaces are designed -- is shaped by the Early Years Learning Framework (EYLF): Belonging, Being and Becoming. Children at Flourish ELC don't just attend a centre; they belong to a warm, vibrant community that celebrates every step of their journey.</w:t>
+        <w:t>Flourish Early Learning Centre is a purpose-built childcare centre welcoming families in and around Gables. Everything here, from the way our educators engage with children to the way our spaces are designed, is shaped by the Early Years Learning Framework (EYLF): Belonging, Being and Becoming. Children at Flourish ELC don't just attend a centre; they belong to a warm, vibrant community that celebrates every step of their journey.</w:t>
       </w:r>
     </w:p>
     <w:p>
@@ -530,7 +530,7 @@
     </w:p>
     <w:p>
       <w:r>
-        <w:t>Our curriculum covers the learning areas that matter most in a child's early years. STEM Learning, Creative Arts, Language, Mathematics, Fine Motor Skills, and Music and Movement build the foundations children carry into school and beyond. Cultural Understanding, Social Justice, Independence, Exercise, Health, and Social and Emotional development round out a program that sees children as whole people -- curious, capable, and full of potential.</w:t>
+        <w:t>Our curriculum covers the learning areas that matter most in a child's early years. STEM Learning, Creative Arts, Language, Mathematics, Fine Motor Skills, and Music and Movement build the foundations children carry into school and beyond. Cultural Understanding, Social Justice, Independence, Exercise, Health, and Social and Emotional development round out a program that sees children as whole people, curious, capable, and full of potential.</w:t>
         <w:br/>
         <w:br/>
         <w:t>Five nutritious meals are prepared and served each day: breakfast, morning tea, lunch, afternoon tea, and a late snack. School readiness programs are threaded through our curriculum so that when children move on to kindergarten, they do so with confidence and genuine enthusiasm for learning.</w:t>
@@ -546,7 +546,7 @@
     </w:p>
     <w:p>
       <w:r>
-        <w:t>Our team of qualified, passionate educators meets and exceeds the National Quality Framework (NQF). Their dedication shows in every interaction -- in the way they notice a child's spark of curiosity, the way they support a child who needs a moment, and the way they celebrate every milestone. The Flourish ELC environment itself has been purpose-built: safe, welcoming, and designed to let children explore and grow.</w:t>
+        <w:t>Our team of qualified, passionate educators meets and exceeds the National Quality Framework (NQF). Their dedication shows in every interaction, in the way they notice a child's spark of curiosity, the way they support a child who needs a moment, and the way they celebrate every milestone. The Flourish ELC environment itself has been purpose-built: safe, welcoming, and designed to let children explore and grow.</w:t>
         <w:br/>
         <w:br/>
         <w:t>We are open 7:00am to 6:00pm Monday to Friday. Our parent communication app sends real-time updates so families near Gables stay genuinely connected to their child's day, even on the busiest mornings.</w:t>
@@ -583,7 +583,7 @@
     </w:p>
     <w:p>
       <w:r>
-        <w:t>Breakfast, morning tea, lunch, afternoon tea, and a late snack -- five nutritious meals every weekday.</w:t>
+        <w:t>Breakfast, morning tea, lunch, afternoon tea, and a late snack, five nutritious meals every weekday.</w:t>
       </w:r>
     </w:p>
     <w:p>
@@ -674,7 +674,7 @@
     </w:p>
     <w:p>
       <w:r>
-        <w:t>Families near Grantham Farm looking for childcare that goes beyond the basics will find exactly that at Flourish Early Learning Centre. Our purpose-built centre is guided by the Early Years Learning Framework (EYLF) -- Belonging, Being and Becoming -- and staffed by qualified educators who genuinely love what they do. At Flourish ELC, children are known, celebrated, and given every opportunity to thrive.</w:t>
+        <w:t>Families near Grantham Farm looking for childcare that goes beyond the basics will find exactly that at Flourish Early Learning Centre. Our purpose-built centre is guided by the Early Years Learning Framework (EYLF): Belonging, Being and Becoming, and staffed by qualified educators who genuinely love what they do. At Flourish ELC, children are known, celebrated, and given every opportunity to thrive.</w:t>
       </w:r>
     </w:p>
     <w:p>
@@ -690,7 +690,7 @@
         <w:t>Our daily programs are anything but ordinary. STEM Learning, Creative Arts, Language, Mathematics, Music and Movement, and Fine Motor Skills are woven into play-based experiences that make learning feel like the adventure it should be. Cultural Understanding, Social Justice, Social and Emotional development, Independence, Exercise, and Health complete a curriculum designed to grow children in every sense of the word.</w:t>
         <w:br/>
         <w:br/>
-        <w:t>Five nutritious meals are prepared and served each day -- breakfast, morning tea, lunch, afternoon tea, and a late snack. Our school readiness programs ensure that when children move on to kindergarten, they are ready academically, socially, and emotionally. Nothing is left to chance.</w:t>
+        <w:t>Five nutritious meals are prepared and served each day: breakfast, morning tea, lunch, afternoon tea, and a late snack. Our school readiness programs ensure that when children move on to kindergarten, they are ready academically, socially, and emotionally. Nothing is left to chance.</w:t>
       </w:r>
     </w:p>
     <w:p>
@@ -706,7 +706,7 @@
         <w:t>Our facility near Grantham Farm has been designed from the ground up for children aged 0 to 5. Safe, bright, and welcoming, it meets and exceeds the National Quality Framework (NQF) in every area. Families can trust that the people caring for their children hold formal qualifications and are committed to continuous professional growth.</w:t>
         <w:br/>
         <w:br/>
-        <w:t>We are open 7:00am to 6:00pm Monday to Friday. The Flourish ELC parent communication app keeps families connected throughout the day with real-time updates, photos, and observations -- a small but meaningful way of saying your child's day matters to us as much as it does to you.</w:t>
+        <w:t>We are open 7:00am to 6:00pm Monday to Friday. The Flourish ELC parent communication app keeps families connected throughout the day with real-time updates, photos, and observations, a small but meaningful way of saying your child's day matters to us as much as it does to you.</w:t>
       </w:r>
     </w:p>
     <w:p>
@@ -831,7 +831,7 @@
     </w:p>
     <w:p>
       <w:r>
-        <w:t>Flourish Early Learning Centre offers families near Riverstone a warm, purpose-built early learning environment where children are known by name, celebrated for who they are, and gently guided toward all they are becoming. Our programs are shaped by the Early Years Learning Framework (EYLF) -- Belonging, Being and Becoming -- and delivered by qualified educators who bring both skill and heart to every day.</w:t>
+        <w:t>Flourish Early Learning Centre offers families near Riverstone a warm, purpose-built early learning environment where children are known by name, celebrated for who they are, and gently guided toward all they are becoming. Our programs are shaped by the Early Years Learning Framework (EYLF): Belonging, Being and Becoming, and delivered by qualified educators who bring both skill and heart to every day.</w:t>
       </w:r>
     </w:p>
     <w:p>
@@ -844,7 +844,7 @@
     </w:p>
     <w:p>
       <w:r>
-        <w:t>At Flourish ELC, every day is packed with rich learning experiences. Creative Arts, STEM Learning, Language, Mathematics, Fine Motor Skills, Music and Movement, Cultural Understanding, Social Justice, Independence, Exercise, Health, and Social and Emotional development are all part of our curriculum. These areas are not taught in isolation -- they come to life through play, projects, conversations, and shared discovery.</w:t>
+        <w:t>At Flourish ELC, every day is packed with rich learning experiences. Creative Arts, STEM Learning, Language, Mathematics, Fine Motor Skills, Music and Movement, Cultural Understanding, Social Justice, Independence, Exercise, Health, and Social and Emotional development are all part of our curriculum. These areas are not taught in isolation: they come to life through play, projects, conversations, and shared discovery.</w:t>
         <w:br/>
         <w:br/>
         <w:t>Five nutritious meals are served each day: breakfast, morning tea, lunch, afternoon tea, and a late snack. Our school readiness programs prepare children thoroughly for the transition to kindergarten, focusing on the skills and confidence they need to step into formal education with a smile.</w:t>
@@ -860,10 +860,13 @@
     </w:p>
     <w:p>
       <w:r>
-        <w:t>Our purpose-built centre near Riverstone meets and exceeds the National Quality Framework (NQF). That means every aspect of the physical environment, our educator qualifications, our program quality, and our family partnerships has been thoughtfully considered and regularly assessed. Families choose Flourish ELC because they trust that standard of care.</w:t>
+        <w:t>Our purpose-built centre near Riverstone meets and exceeds the National Quality Framework (NQF). That means every aspect of the physical environment, our educator qualifications, our program quality, and our family partnerships has been thoughtfully considered and regularly assessed against Australia's highest national standards for early education.</w:t>
         <w:br/>
         <w:br/>
-        <w:t>We are open Monday to Friday, 7:00am to 6:00pm. Our parent communication app delivers real-time updates and photos throughout the day so families always feel connected, no matter how busy things get.</w:t>
+        <w:t>Our educators are qualified, warm, and genuinely committed to each child they care for. They take the time to know every child as an individual: what makes them curious, what makes them feel safe, and what they are ready to explore next. That personal attention makes a real difference to children and families alike.</w:t>
+        <w:br/>
+        <w:br/>
+        <w:t>We are open Monday to Friday, 7:00am to 6:00pm. Our parent communication app delivers real-time updates and photos throughout the day so families near Riverstone always feel connected to what their child is experiencing, no matter how busy life gets.</w:t>
       </w:r>
     </w:p>
     <w:p>
@@ -884,7 +887,7 @@
     </w:p>
     <w:p>
       <w:r>
-        <w:t>From 6 weeks through to school age, with dedicated programs and spaces for infants, toddlers, and preschoolers.</w:t>
+        <w:t>From 6 weeks through to school age, with dedicated programs and spaces for infants, toddlers, and preschoolers at every stage of development.</w:t>
       </w:r>
     </w:p>
     <w:p>
@@ -897,7 +900,7 @@
     </w:p>
     <w:p>
       <w:r>
-        <w:t>Five nutritious meals daily: breakfast, morning tea, lunch, afternoon tea, and a late snack. Dietary requirements and allergies are always catered for.</w:t>
+        <w:t>Five nutritious meals daily: breakfast, morning tea, lunch, afternoon tea, and a late snack. Dietary requirements and allergies are always catered for with care.</w:t>
       </w:r>
     </w:p>
     <w:p>
@@ -910,7 +913,7 @@
     </w:p>
     <w:p>
       <w:r>
-        <w:t>Monday to Friday, 7:00am to 6:00pm.</w:t>
+        <w:t>Monday to Friday, 7:00am to 6:00pm, giving families a generous window for drop-off and pick-up.</w:t>
       </w:r>
     </w:p>
     <w:p>
@@ -936,7 +939,7 @@
     </w:p>
     <w:p>
       <w:r>
-        <w:t>School readiness is woven through our programs from an early age, building literacy, numeracy, independence, and social skills so children transition to kindergarten feeling genuinely ready.</w:t>
+        <w:t>School readiness is woven through our programs from an early age, building literacy, numeracy, independence, and social skills so children transition to kindergarten feeling genuinely ready and excited.</w:t>
       </w:r>
     </w:p>
     <w:p>
@@ -988,7 +991,7 @@
     </w:p>
     <w:p>
       <w:r>
-        <w:t>Flourish Early Learning Centre is a purpose-built early learning centre welcoming families near Mulgrave into a warm, vibrant community. Guided by the Early Years Learning Framework (EYLF) -- Belonging, Being and Becoming -- our centre is a place where children feel secure, excited, and free to explore who they are. Our qualified, passionate educators are the heart of everything we do.</w:t>
+        <w:t>Flourish Early Learning Centre is a purpose-built early learning centre welcoming families near Mulgrave into a warm, vibrant community. Guided by the Early Years Learning Framework (EYLF): Belonging, Being and Becoming, our centre is a place where children feel secure, excited, and free to explore who they are. Our qualified, passionate educators are the heart of everything we do.</w:t>
       </w:r>
     </w:p>
     <w:p>
@@ -1001,7 +1004,7 @@
     </w:p>
     <w:p>
       <w:r>
-        <w:t>Learning at Flourish ELC stretches across the full range of early childhood development. STEM Learning, Creative Arts, Language, Mathematics, Music and Movement, Fine Motor Skills, Cultural Understanding, Social Justice, Exercise, Health, Independence, and Social and Emotional development are all part of our daily rhythm. Children discover, create, move, connect, and grow -- and every experience is intentional.</w:t>
+        <w:t>Learning at Flourish ELC stretches across the full range of early childhood development. STEM Learning, Creative Arts, Language, Mathematics, Music and Movement, Fine Motor Skills, Cultural Understanding, Social Justice, Exercise, Health, Independence, and Social and Emotional development are all part of our daily rhythm. Children discover, create, move, connect, and grow, and every experience is intentional.</w:t>
         <w:br/>
         <w:br/>
         <w:t>Five nutritious meals are prepared and served each weekday: breakfast, morning tea, lunch, afternoon tea, and a late snack. Our school readiness programs are thoughtfully integrated into the curriculum so that children are well-prepared for the next chapter of their education when the time comes.</w:t>
@@ -1017,7 +1020,7 @@
     </w:p>
     <w:p>
       <w:r>
-        <w:t>Our facility near Mulgrave has been purpose-built for children from 6 weeks to school age. It meets and exceeds the National Quality Framework (NQF), which gives families confidence that everything -- the spaces, the programs, the educator qualifications, and the family partnerships -- is held to Australia's highest national standards for early education.</w:t>
+        <w:t>Our facility near Mulgrave has been purpose-built for children from 6 weeks to school age. It meets and exceeds the National Quality Framework (NQF), which gives families confidence that everything, including the spaces, the programs, and the educator qualifications, and the family partnerships, is held to Australia's highest national standards for early education.</w:t>
         <w:br/>
         <w:br/>
         <w:t>We are open 7:00am to 6:00pm Monday to Friday. Our parent communication app keeps families connected throughout the day with real-time updates, photos, and observations. It is one of the many ways Flourish ELC makes families feel truly part of their child's world, even when they are apart.</w:t>
@@ -1143,7 +1146,7 @@
     </w:p>
     <w:p>
       <w:r>
-        <w:t>Flourish Early Learning Centre is a warm, purpose-built preschool in Oakville where children step into a world designed entirely for them. Our preschool programs are guided by the Early Years Learning Framework (EYLF) -- Belonging, Being and Becoming -- and delivered by qualified educators who genuinely care about every child's growth. Families in Oakville choose Flourish ELC because it is the kind of place that children look forward to, and parents feel proud of.</w:t>
+        <w:t>Flourish Early Learning Centre is a warm, purpose-built preschool in Oakville where children step into a world designed entirely for them. Our preschool programs are guided by the Early Years Learning Framework (EYLF): Belonging, Being and Becoming, and delivered by qualified educators who genuinely care about every child's growth. Families in Oakville choose Flourish ELC because it is the kind of place that children look forward to, and parents feel proud of.</w:t>
       </w:r>
     </w:p>
     <w:p>
@@ -1159,7 +1162,7 @@
         <w:t>Our preschool curriculum is designed to develop children across every dimension. Language, Mathematics, and Fine Motor Skills lay the academic groundwork that children carry into kindergarten. Creative Arts, Music and Movement, and STEM Learning spark the curiosity and creative thinking that make learning joyful. Cultural Understanding, Social Justice, Social and Emotional development, Independence, Exercise, and Health complete a program that sees each child as a whole person.</w:t>
         <w:br/>
         <w:br/>
-        <w:t>Children are served five nutritious meals every weekday -- breakfast, morning tea, lunch, afternoon tea, and a late snack. Our dedicated school readiness programs ensure preschoolers are socially, emotionally, and academically prepared to transition into kindergarten with genuine excitement and confidence.</w:t>
+        <w:t>Children are served five nutritious meals every weekday: breakfast, morning tea, lunch, afternoon tea, and a late snack. Our dedicated school readiness programs ensure preschoolers are socially, emotionally, and academically prepared to transition into kindergarten with genuine excitement and confidence.</w:t>
       </w:r>
     </w:p>
     <w:p>
@@ -1172,7 +1175,7 @@
     </w:p>
     <w:p>
       <w:r>
-        <w:t>Our purpose-built centre in Oakville meets and exceeds the National Quality Framework (NQF), which means our educators, spaces, and programs are all assessed against Australia's highest standards for early education. Children spend their preschool years in an environment that has been thoughtfully designed for their age and stage -- safe, stimulating, and genuinely welcoming.</w:t>
+        <w:t>Our purpose-built centre in Oakville meets and exceeds the National Quality Framework (NQF), which means our educators, spaces, and programs are all assessed against Australia's highest standards for early education. Children spend their preschool years in an environment that has been thoughtfully designed for their age and stage, safe, stimulating, and genuinely welcoming.</w:t>
         <w:br/>
         <w:br/>
         <w:t>We are open Monday to Friday, 7:00am to 6:00pm. Our parent communication app keeps families connected throughout the day with real-time updates and photos, so even when you are far away, you feel close to what your child is experiencing.</w:t>
@@ -1248,7 +1251,7 @@
     </w:p>
     <w:p>
       <w:r>
-        <w:t>The EYLF shapes how our educators plan experiences, observe children, and support learning -- always with belonging, wellbeing, and engagement at the heart of practice.</w:t>
+        <w:t>The EYLF shapes how our educators plan experiences, observe children, and support learning, always with belonging, wellbeing, and engagement at the heart of practice.</w:t>
       </w:r>
     </w:p>
     <w:p>
@@ -1298,7 +1301,7 @@
     </w:p>
     <w:p>
       <w:r>
-        <w:t>Flourish Early Learning Centre is a purpose-built preschool near Box Hill where the Early Years Learning Framework (EYLF) -- Belonging, Being and Becoming -- is not just a document on a wall but the living philosophy behind every experience. Our qualified, passionate educators know each child by name, by interest, and by strength. Families near Box Hill choose Flourish ELC because their children flourish here in every sense of the word.</w:t>
+        <w:t>Flourish Early Learning Centre is a purpose-built preschool near Box Hill where the Early Years Learning Framework (EYLF): Belonging, Being and Becoming, is not just a document on a wall but the living philosophy behind every experience. Our qualified, passionate educators know each child by name, by interest, and by strength. Families near Box Hill choose Flourish ELC because their children flourish here in every sense of the word.</w:t>
       </w:r>
     </w:p>
     <w:p>
@@ -1311,10 +1314,10 @@
     </w:p>
     <w:p>
       <w:r>
-        <w:t>Our preschool programs near Box Hill are rich and varied. Language, Mathematics, and Fine Motor Skills build the academic foundations children need. STEM Learning, Creative Arts, and Music and Movement make every day an adventure. Cultural Understanding, Social Justice, Social and Emotional development, Independence, Exercise, and Health round out a program where the whole child -- not just the academic child -- is celebrated and supported.</w:t>
+        <w:t>Our preschool programs near Box Hill are rich and varied. Language, Mathematics, and Fine Motor Skills build the academic foundations children need. STEM Learning, Creative Arts, and Music and Movement make every day an adventure. Cultural Understanding, Social Justice, Social and Emotional development, Independence, Exercise, and Health round out a program where the whole child, not just the academic child, is celebrated and supported.</w:t>
         <w:br/>
         <w:br/>
-        <w:t>Five nutritious meals are prepared and served each weekday: breakfast, morning tea, lunch, afternoon tea, and a late snack. School readiness programs are thoughtfully woven through our preschool curriculum so that children are genuinely ready -- socially, emotionally, and academically -- when kindergarten arrives.</w:t>
+        <w:t>Five nutritious meals are prepared and served each weekday: breakfast, morning tea, lunch, afternoon tea, and a late snack. School readiness programs are thoughtfully woven through our preschool curriculum so that children are genuinely ready, socially, emotionally, and academically, when kindergarten arrives.</w:t>
       </w:r>
     </w:p>
     <w:p>
@@ -1327,7 +1330,7 @@
     </w:p>
     <w:p>
       <w:r>
-        <w:t>Our purpose-built centre meets and exceeds the National Quality Framework (NQF), which means families near Box Hill can trust that every aspect of our preschool -- the educators, the spaces, the programs, and the partnerships with families -- has been carefully assessed against Australia's national quality standards. We take that responsibility seriously and work hard to exceed it.</w:t>
+        <w:t>Our purpose-built centre meets and exceeds the National Quality Framework (NQF), which means families near Box Hill can trust that every aspect of our preschool, including the educators, the spaces, the programs, and the partnerships with families, has been carefully assessed against Australia's national quality standards. We take that responsibility seriously and work hard to exceed it.</w:t>
         <w:br/>
         <w:br/>
         <w:t>We are open Monday to Friday, 7:00am to 6:00pm. Our parent communication app delivers real-time updates, photos, and observations throughout the preschool day, so families always feel connected to their child's world.</w:t>
@@ -1453,7 +1456,7 @@
     </w:p>
     <w:p>
       <w:r>
-        <w:t>Flourish Early Learning Centre is a purpose-built preschool near Vineyard where the Early Years Learning Framework (EYLF) -- Belonging, Being and Becoming -- shapes every experience, every relationship, and every room. Our qualified educators bring knowledge and genuine warmth to the preschool years, creating an environment where children discover their strengths, build their confidence, and develop a love of learning that will stay with them for life. Families near Vineyard trust Flourish ELC because they can see the difference it makes.</w:t>
+        <w:t>Flourish Early Learning Centre is a purpose-built preschool near Vineyard where the Early Years Learning Framework (EYLF): Belonging, Being and Becoming, shapes every experience, every relationship, and every room. Our qualified educators bring knowledge and genuine warmth to the preschool years, creating an environment where children discover their strengths, build their confidence, and develop a love of learning that will stay with them for life. Families near Vineyard trust Flourish ELC because they can see the difference it makes.</w:t>
       </w:r>
     </w:p>
     <w:p>
@@ -1466,10 +1469,10 @@
     </w:p>
     <w:p>
       <w:r>
-        <w:t>Learning at Flourish ELC is broad, deep, and joyful. Language and Mathematics build strong academic foundations. STEM Learning and Creative Arts cultivate the problem-solving and creative thinking children will use their whole lives. Fine Motor Skills, Music and Movement, and Exercise support physical development in ways that are fun and confidence-building. Cultural Understanding, Social Justice, Independence, Health, and Social and Emotional development round out a curriculum where the whole child is cherished.</w:t>
+        <w:t>Learning at Flourish ELC is broad, deep, and joyful. Language and Mathematics build strong academic foundations. STEM Learning and Creative Arts cultivate inventive, creative thinking that children carry with them their whole lives. Fine Motor Skills, Music and Movement, and Exercise support physical development in ways that are fun and confidence-building. Cultural Understanding, Social Justice, Independence, Health, and Social and Emotional development round out a curriculum where the whole child is cherished.</w:t>
         <w:br/>
         <w:br/>
-        <w:t>Five nutritious meals are served each weekday -- breakfast, morning tea, lunch, afternoon tea, and a late snack. School readiness is embedded in our preschool programs, so by the time children move on to kindergarten, they carry both the skills and the spark to embrace it.</w:t>
+        <w:t>Five nutritious meals are served each weekday: breakfast, morning tea, lunch, afternoon tea, and a late snack. School readiness is embedded in our preschool programs, so by the time children move on to kindergarten, they carry both the skills and the spark to embrace it.</w:t>
       </w:r>
     </w:p>
     <w:p>
@@ -1608,7 +1611,7 @@
     </w:p>
     <w:p>
       <w:r>
-        <w:t>Flourish Early Learning Centre is a warm, purpose-built preschool near Gables where the Early Years Learning Framework (EYLF) -- Belonging, Being and Becoming -- is more than a framework: it is the spirit of everything we do. Our qualified, passionate educators create an environment where preschoolers feel safe, celebrated, and inspired to explore the world around them. Families near Gables love Flourish ELC because their children thrive here, and they can see it every single day.</w:t>
+        <w:t>Flourish Early Learning Centre is a warm, purpose-built preschool near Gables where the Early Years Learning Framework (EYLF): Belonging, Being and Becoming, is more than a framework: it is the spirit of everything we do. Our qualified, passionate educators create an environment where preschoolers feel safe, celebrated, and inspired to explore the world around them. Families near Gables love Flourish ELC because their children thrive here, and they can see it every single day.</w:t>
       </w:r>
     </w:p>
     <w:p>
@@ -1621,10 +1624,10 @@
     </w:p>
     <w:p>
       <w:r>
-        <w:t>Our preschool curriculum is carefully designed to nurture children across every dimension of development. Language, Mathematics, and Fine Motor Skills build the academic skills children need for kindergarten. Creative Arts, Music and Movement, and STEM Learning bring the joy and wonder that keep children genuinely engaged. Cultural Understanding, Social Justice, Social and Emotional development, Independence, Exercise, and Health complete a program that looks at the whole child -- not just what they know, but who they are becoming.</w:t>
+        <w:t>Our preschool curriculum is carefully designed to nurture children across every dimension of development. Language, Mathematics, and Fine Motor Skills build the academic skills children need for kindergarten. Creative Arts, Music and Movement, and STEM Learning bring the joy and wonder that keep children genuinely engaged. Cultural Understanding, Social Justice, Social and Emotional development, Independence, Exercise, and Health complete a program that looks at the whole child, not just what they know, but who they are becoming.</w:t>
         <w:br/>
         <w:br/>
-        <w:t>Five nutritious meals are prepared fresh each weekday: breakfast, morning tea, lunch, afternoon tea, and a late snack. Our school readiness programs are woven through the preschool years so children are thoroughly prepared -- academically and socially -- for their next adventure.</w:t>
+        <w:t>Five nutritious meals are prepared fresh each weekday: breakfast, morning tea, lunch, afternoon tea, and a late snack. Our school readiness programs are woven through the preschool years so children are thoroughly prepared, academically and socially, for their next adventure.</w:t>
       </w:r>
     </w:p>
     <w:p>
@@ -1637,7 +1640,7 @@
     </w:p>
     <w:p>
       <w:r>
-        <w:t>Our purpose-built centre near Gables meets and exceeds the National Quality Framework (NQF). Every element of the centre -- from the learning spaces and outdoor environments to the qualifications our educators hold and the partnerships we build with families -- is assessed against Australia's highest national standards. We take pride in not just meeting those standards, but genuinely surpassing them.</w:t>
+        <w:t>Our purpose-built centre near Gables meets and exceeds the National Quality Framework (NQF). Every element of the centre, from the learning spaces and outdoor environments to the qualifications our educators hold and the partnerships we build with families, is assessed against Australia's highest national standards. We take pride in not just meeting those standards, but genuinely surpassing them.</w:t>
         <w:br/>
         <w:br/>
         <w:t>We are open Monday to Friday, 7:00am to 6:00pm. Our parent communication app shares real-time updates, photos, and observations throughout the day, keeping families near Gables close to their child's world even during a busy workday.</w:t>
@@ -1674,7 +1677,7 @@
     </w:p>
     <w:p>
       <w:r>
-        <w:t>Breakfast, morning tea, lunch, afternoon tea, and a late snack -- five nutritious meals prepared fresh every weekday.</w:t>
+        <w:t>Breakfast, morning tea, lunch, afternoon tea, and a late snack, five nutritious meals prepared fresh every weekday.</w:t>
       </w:r>
     </w:p>
     <w:p>
@@ -1763,7 +1766,7 @@
     </w:p>
     <w:p>
       <w:r>
-        <w:t>Flourish Early Learning Centre is a purpose-built preschool near Grantham Farm where the Early Years Learning Framework (EYLF) -- Belonging, Being and Becoming -- guides every experience. Our qualified educators are passionate about early childhood and bring that passion to life in programs that are joyful, intentional, and genuinely child-centred. Families near Grantham Farm trust Flourish ELC because it is the kind of preschool that makes a real difference.</w:t>
+        <w:t>Flourish Early Learning Centre is a purpose-built preschool near Grantham Farm where the Early Years Learning Framework (EYLF): Belonging, Being and Becoming, guides every experience. Our qualified educators are passionate about early childhood and bring that passion to life in programs that are joyful, intentional, and genuinely child-centred. Families near Grantham Farm trust Flourish ELC because it is the kind of preschool that makes a real difference.</w:t>
       </w:r>
     </w:p>
     <w:p>
@@ -1779,7 +1782,7 @@
         <w:t>At Flourish ELC, preschool means far more than structured sitting and worksheets. Language, Mathematics, and Fine Motor Skills are developed through play-based experiences that children find genuinely exciting. STEM Learning and Creative Arts cultivate the thinking and creative skills that serve children well beyond the preschool years. Music and Movement, Cultural Understanding, Social Justice, Independence, Exercise, Health, and Social and Emotional development complete a curriculum that honours childhood while building bright futures.</w:t>
         <w:br/>
         <w:br/>
-        <w:t>Five nutritious meals are served each weekday -- breakfast, morning tea, lunch, afternoon tea, and a late snack. School readiness programs are embedded throughout the preschool years, ensuring children have the academic foundations, the social skills, and the emotional confidence to love kindergarten from day one.</w:t>
+        <w:t>Five nutritious meals are served each weekday: breakfast, morning tea, lunch, afternoon tea, and a late snack. School readiness programs are embedded throughout the preschool years, ensuring children have the academic foundations, the social skills, and the emotional confidence to love kindergarten from day one.</w:t>
       </w:r>
     </w:p>
     <w:p>
@@ -1795,7 +1798,7 @@
         <w:t>Our purpose-built preschool near Grantham Farm meets and exceeds the National Quality Framework (NQF). Families can feel genuinely confident about the quality of care their children receive, knowing that our educators hold recognised qualifications and that our environment has been designed and assessed against Australia's national standards for early education.</w:t>
         <w:br/>
         <w:br/>
-        <w:t>We are open Monday to Friday, 7:00am to 6:00pm. Our parent communication app keeps families connected throughout the preschool day with real-time updates, photos, and milestones -- because what happens in our preschool matters, and we know you want to be part of it.</w:t>
+        <w:t>We are open Monday to Friday, 7:00am to 6:00pm. Our parent communication app keeps families connected throughout the preschool day with real-time updates, photos, and milestones, because what happens in our preschool matters, and we know you want to be part of it.</w:t>
       </w:r>
     </w:p>
     <w:p>
@@ -1918,7 +1921,7 @@
     </w:p>
     <w:p>
       <w:r>
-        <w:t>Flourish Early Learning Centre is a purpose-built preschool near Riverstone guided by the Early Years Learning Framework (EYLF) -- Belonging, Being and Becoming. Our qualified educators bring both professional expertise and genuine warmth to preschool, creating an environment where children feel at home, feel inspired, and feel proud of who they are. Families near Riverstone choose Flourish ELC because they can see -- and feel -- the difference a truly great preschool makes.</w:t>
+        <w:t>Flourish Early Learning Centre is a purpose-built preschool near Riverstone guided by the Early Years Learning Framework (EYLF): Belonging, Being and Becoming. Our qualified educators bring both professional expertise and genuine warmth to preschool, creating an environment where children feel at home, feel inspired, and feel proud of who they are. Families near Riverstone choose Flourish ELC because they can see, and feel, the difference a truly great preschool makes.</w:t>
       </w:r>
     </w:p>
     <w:p>
@@ -1947,7 +1950,7 @@
     </w:p>
     <w:p>
       <w:r>
-        <w:t>Our facility near Riverstone has been purpose-built with preschoolers in mind and meets and exceeds the National Quality Framework (NQF). Families can be confident that everything -- the spaces, the people, the programs, and the partnerships -- is aligned with Australia's highest standards for early education. That confidence is something Flourish ELC families describe as one of the most important things we offer.</w:t>
+        <w:t>Our facility near Riverstone has been purpose-built with preschoolers in mind and meets and exceeds the National Quality Framework (NQF). Families can be confident that everything, including the spaces, the people, and the programs, and the partnerships, is aligned with Australia's highest standards for early education. That confidence is something Flourish ELC families describe as one of the most important things we offer.</w:t>
         <w:br/>
         <w:br/>
         <w:t>We are open Monday to Friday, 7:00am to 6:00pm. Our parent communication app keeps families genuinely connected throughout the preschool day with real-time photos, updates, and observations.</w:t>
@@ -2023,7 +2026,7 @@
     </w:p>
     <w:p>
       <w:r>
-        <w:t>The Early Years Learning Framework guides early educators across Australia in planning and delivering high-quality learning experiences. At Flourish ELC, it underpins everything -- from the way we design our spaces to the way our educators engage with children.</w:t>
+        <w:t>The Early Years Learning Framework guides early educators across Australia in planning and delivering high-quality learning experiences. At Flourish ELC, it underpins everything, from the way we design our spaces to the way our educators engage with children.</w:t>
       </w:r>
     </w:p>
     <w:p>
@@ -2073,7 +2076,7 @@
     </w:p>
     <w:p>
       <w:r>
-        <w:t>Flourish Early Learning Centre is a warm, purpose-built preschool near Mulgrave where children are welcomed into an environment shaped by the Early Years Learning Framework (EYLF) -- Belonging, Being and Becoming. Our qualified educators are passionate about the preschool years and create daily experiences that are rich, joyful, and genuinely meaningful. Families near Mulgrave trust Flourish ELC because children love being here, and the learning shows.</w:t>
+        <w:t>Flourish Early Learning Centre is a warm, purpose-built preschool near Mulgrave where children are welcomed into an environment shaped by the Early Years Learning Framework (EYLF): Belonging, Being and Becoming. Our qualified educators are passionate about the preschool years and create daily experiences that are rich, joyful, and genuinely meaningful. Families near Mulgrave trust Flourish ELC because children love being here, and the learning shows.</w:t>
       </w:r>
     </w:p>
     <w:p>
@@ -2102,7 +2105,7 @@
     </w:p>
     <w:p>
       <w:r>
-        <w:t>Our purpose-built preschool near Mulgrave meets and exceeds the National Quality Framework (NQF), which means families can trust the quality of the educators, the spaces, and the programs their children experience every day. That standard is one Flourish ELC takes seriously -- not just as a compliance exercise, but as a reflection of our values.</w:t>
+        <w:t>Our purpose-built preschool near Mulgrave meets and exceeds the National Quality Framework (NQF), which means families can trust the quality of the educators, the spaces, and the programs their children experience every day. That standard is one Flourish ELC takes seriously, and not just as a compliance exercise, but as a reflection of our values.</w:t>
         <w:br/>
         <w:br/>
         <w:t>We are open Monday to Friday, 7:00am to 6:00pm. Our parent communication app keeps families connected with real-time updates and photos throughout the preschool day, because we know how much those little windows into your child's world matter.</w:t>
@@ -2230,7 +2233,7 @@
     </w:p>
     <w:p>
       <w:r>
-        <w:t>Flourish Early Learning Centre offers families in Bull Creek a purpose-built early learning environment where children are guided by the best -- and so are their educators. Our programs are shaped by the Early Years Learning Framework (EYLF) -- Belonging, Being and Becoming -- and delivered by qualified, passionate educators who genuinely love what they do. Bull Creek families choose Flourish ELC because it is a place where children thrive, and parents feel completely at ease.</w:t>
+        <w:t>Flourish Early Learning Centre offers families in Bull Creek a purpose-built early learning environment where children are guided by the best, and so are their educators. Our programs are shaped by the Early Years Learning Framework (EYLF): Belonging, Being and Becoming, and delivered by qualified, passionate educators who genuinely love what they do. Bull Creek families choose Flourish ELC because it is a place where children thrive, and parents feel completely at ease.</w:t>
       </w:r>
     </w:p>
     <w:p>
@@ -2262,7 +2265,7 @@
         <w:t>Our facility in Bull Creek is purpose-built for children aged 6 weeks to school age and meets and exceeds the National Quality Framework (NQF). Families can feel genuinely confident that the quality of care, the educators' qualifications, and the programs their children experience are assessed against Australia's highest national standards for early education.</w:t>
         <w:br/>
         <w:br/>
-        <w:t>We are open Monday to Friday, 7:00am to 6:00pm. Our parent communication app keeps families connected throughout the day with real-time updates, photos, and observations -- a genuine window into your child's world whenever you need it.</w:t>
+        <w:t>We are open Monday to Friday, 7:00am to 6:00pm. Our parent communication app keeps families connected throughout the day with real-time updates, photos, and observations, a genuine window into your child's world whenever you need it.</w:t>
       </w:r>
     </w:p>
     <w:p>
@@ -2387,7 +2390,7 @@
     </w:p>
     <w:p>
       <w:r>
-        <w:t>Flourish Early Learning Centre is a purpose-built early learning centre near Leeming where the Early Years Learning Framework (EYLF) -- Belonging, Being and Becoming -- is the foundation of every program, every interaction, and every space. Our qualified, passionate educators create an environment where children feel genuinely at home, genuinely seen, and genuinely free to learn at their own wonderful pace. Families near Leeming trust Flourish ELC because the warmth and quality are real.</w:t>
+        <w:t>Flourish Early Learning Centre is a purpose-built early learning centre near Leeming where the Early Years Learning Framework (EYLF): Belonging, Being and Becoming, is the foundation of every program, every interaction, and every space. Our qualified, passionate educators create an environment where children feel genuinely at home, genuinely seen, and genuinely free to learn at their own wonderful pace. Families near Leeming trust Flourish ELC because the warmth and quality are real.</w:t>
       </w:r>
     </w:p>
     <w:p>
@@ -2416,7 +2419,7 @@
     </w:p>
     <w:p>
       <w:r>
-        <w:t>Our purpose-built centre near Leeming meets and exceeds the National Quality Framework (NQF). That means every area of the centre -- from the learning environments and outdoor spaces to the educator qualifications and family partnerships -- has been assessed against Australia's national standards for early education. We take pride in the quality that standard represents.</w:t>
+        <w:t>Our purpose-built centre near Leeming meets and exceeds the National Quality Framework (NQF). That means every area of the centre, from the learning environments and outdoor spaces to the educator qualifications and family partnerships, has been assessed against Australia's national standards for early education. We take pride in the quality that standard represents.</w:t>
         <w:br/>
         <w:br/>
         <w:t>We are open Monday to Friday, 7:00am to 6:00pm. Our parent communication app keeps families near Leeming genuinely connected throughout the day with real-time updates, photos, and observations.</w:t>
@@ -2544,7 +2547,7 @@
     </w:p>
     <w:p>
       <w:r>
-        <w:t>Flourish Early Learning Centre is a purpose-built early learning centre near Bateman where families find exactly what they have been looking for: a warm, qualified, and genuinely child-centred environment. Guided by the Early Years Learning Framework (EYLF) -- Belonging, Being and Becoming -- our programs and our people are dedicated to making each child's early years as rich and joyful as possible. Families near Bateman choose Flourish ELC because the quality is evident from the moment you walk through the door.</w:t>
+        <w:t>Flourish Early Learning Centre is a purpose-built early learning centre near Bateman where families find exactly what they have been looking for: a warm, qualified, and genuinely child-centred environment. Guided by the Early Years Learning Framework (EYLF): Belonging, Being and Becoming, our programs and our people are dedicated to making each child's early years as rich and joyful as possible. Families near Bateman choose Flourish ELC because the quality is evident from the moment you walk through the door.</w:t>
       </w:r>
     </w:p>
     <w:p>
@@ -2573,7 +2576,7 @@
     </w:p>
     <w:p>
       <w:r>
-        <w:t>Our purpose-built centre near Bateman meets and exceeds the National Quality Framework (NQF). Families can be confident that the care their children receive is assessed against the highest national standards -- and that we hold ourselves to those standards every day, not just at assessment time.</w:t>
+        <w:t>Our purpose-built centre near Bateman meets and exceeds the National Quality Framework (NQF). Families can be confident that the care their children receive is assessed against the highest national standards, and that we hold ourselves to those standards every day, not just at assessment time.</w:t>
         <w:br/>
         <w:br/>
         <w:t>We are open Monday to Friday, 7:00am to 6:00pm. Our parent communication app keeps families near Bateman genuinely connected with real-time photos, updates, and observations throughout the day.</w:t>
@@ -2701,7 +2704,7 @@
     </w:p>
     <w:p>
       <w:r>
-        <w:t>Flourish Early Learning Centre is a warm, purpose-built early learning centre near Rossmoyne where children are welcomed into an environment guided by the Early Years Learning Framework (EYLF) -- Belonging, Being and Becoming. Our qualified, passionate educators are the heart of Flourish ELC, and it shows. Families near Rossmoyne choose us because their children genuinely love coming, and the development they witness speaks for itself.</w:t>
+        <w:t>Flourish Early Learning Centre is a warm, purpose-built early learning centre near Rossmoyne where children are welcomed into an environment guided by the Early Years Learning Framework (EYLF): Belonging, Being and Becoming. Our qualified, passionate educators are the heart of Flourish ELC, and it shows. Families near Rossmoyne choose us because their children genuinely love coming, and the development they witness speaks for itself.</w:t>
       </w:r>
     </w:p>
     <w:p>
@@ -2714,7 +2717,7 @@
     </w:p>
     <w:p>
       <w:r>
-        <w:t>Our programs near Rossmoyne weave together all the learning areas that matter in a child's early years. Language, Mathematics, and Fine Motor Skills build academic foundations. STEM Learning and Creative Arts spark curiosity and inventive thinking. Music and Movement, Cultural Understanding, Social Justice, Independence, Exercise, Health, and Social and Emotional development ensure that every child -- in every dimension -- is growing and flourishing.</w:t>
+        <w:t>Our programs near Rossmoyne weave together all the learning areas that matter in a child's early years. Language, Mathematics, and Fine Motor Skills build academic foundations. STEM Learning and Creative Arts spark curiosity and inventive thinking. Music and Movement, Cultural Understanding, Social Justice, Independence, Exercise, Health, and Social and Emotional development ensure that every child, in every dimension, is growing and flourishing.</w:t>
         <w:br/>
         <w:br/>
         <w:t>Five nutritious meals are served each weekday: breakfast, morning tea, lunch, afternoon tea, and a late snack. Our school readiness programs are carefully integrated throughout our curriculum so that children near Rossmoyne are socially, emotionally, and academically prepared to embrace kindergarten when the time comes.</w:t>
@@ -2730,10 +2733,13 @@
     </w:p>
     <w:p>
       <w:r>
-        <w:t>Our purpose-built centre near Rossmoyne meets and exceeds the National Quality Framework (NQF). Every aspect of the centre has been assessed against Australia's national quality standards -- from the learning environments and educator qualifications to the family partnerships and leadership practices. We are proud of that standard and work hard every day to uphold and exceed it.</w:t>
+        <w:t>Our purpose-built centre near Rossmoyne meets and exceeds the National Quality Framework (NQF). Every aspect of the centre has been assessed against Australia's national quality standards, from the learning environments and educator qualifications to the family partnerships and leadership practices. We are proud of that standard and work hard every day to uphold and exceed it.</w:t>
         <w:br/>
         <w:br/>
-        <w:t>We are open Monday to Friday, 7:00am to 6:00pm. Our parent communication app keeps families near Rossmoyne connected throughout the day with real-time updates, photos, and notes from our educators.</w:t>
+        <w:t>Our educators are qualified, caring professionals who take the time to genuinely know each child. They observe, listen, and respond to what children need, creating a day-to-day experience that is both nurturing and stimulating. That kind of attention is what makes Flourish ELC feel different from the moment families walk through the door.</w:t>
+        <w:br/>
+        <w:br/>
+        <w:t>We are open Monday to Friday, 7:00am to 6:00pm. Our parent communication app keeps families near Rossmoyne connected throughout the day with real-time updates, photos, and notes from our educators, so no milestone goes unshared.</w:t>
       </w:r>
     </w:p>
     <w:p>
@@ -2754,7 +2760,7 @@
     </w:p>
     <w:p>
       <w:r>
-        <w:t>We welcome children from 6 weeks to school age, with dedicated programs and spaces for each developmental stage.</w:t>
+        <w:t>We welcome children from 6 weeks to school age, with dedicated programs and spaces for infants, toddlers, and preschoolers.</w:t>
       </w:r>
     </w:p>
     <w:p>
@@ -2767,7 +2773,7 @@
     </w:p>
     <w:p>
       <w:r>
-        <w:t>Five nutritious meals: breakfast, morning tea, lunch, afternoon tea, and a late snack prepared fresh every weekday.</w:t>
+        <w:t>Five nutritious meals prepared fresh every weekday: breakfast, morning tea, lunch, afternoon tea, and a late snack. All dietary requirements and allergies are carefully managed.</w:t>
       </w:r>
     </w:p>
     <w:p>
@@ -2780,7 +2786,7 @@
     </w:p>
     <w:p>
       <w:r>
-        <w:t>Monday to Friday, 7:00am to 6:00pm.</w:t>
+        <w:t>Monday to Friday, 7:00am to 6:00pm, designed to support busy working families.</w:t>
       </w:r>
     </w:p>
     <w:p>
@@ -2793,7 +2799,7 @@
     </w:p>
     <w:p>
       <w:r>
-        <w:t>The app delivers real-time updates, photos, and observations throughout the day so you always have a window into your child's world.</w:t>
+        <w:t>The app delivers real-time updates, photos, and observations throughout the day so you always have a clear, warm window into your child's world.</w:t>
       </w:r>
     </w:p>
     <w:p>
@@ -2806,7 +2812,7 @@
     </w:p>
     <w:p>
       <w:r>
-        <w:t>We build literacy, numeracy, social and emotional skills, and independence progressively through our programs so children are genuinely ready for kindergarten.</w:t>
+        <w:t>We build literacy, numeracy, social and emotional skills, and independence progressively through our programs so children transition to kindergarten genuinely ready, confident, and excited for what comes next.</w:t>
       </w:r>
     </w:p>
     <w:p>
@@ -2858,7 +2864,7 @@
     </w:p>
     <w:p>
       <w:r>
-        <w:t>Flourish Early Learning Centre is a purpose-built early learning centre near Shelley where families find something genuinely special: a warm community, qualified educators, and programs shaped by the Early Years Learning Framework (EYLF) -- Belonging, Being and Becoming. At Flourish ELC, children are known, celebrated, and supported in becoming the best version of themselves. Families near Shelley trust us because their children love it here, and the learning is real.</w:t>
+        <w:t>Flourish Early Learning Centre is a purpose-built early learning centre near Shelley where families find something genuinely special: a warm community, qualified educators, and programs shaped by the Early Years Learning Framework (EYLF): Belonging, Being and Becoming. At Flourish ELC, children are known, celebrated, and supported in becoming the best version of themselves. Families near Shelley trust us because their children love it here, and the learning is real.</w:t>
       </w:r>
     </w:p>
     <w:p>
@@ -2887,7 +2893,7 @@
     </w:p>
     <w:p>
       <w:r>
-        <w:t>Our purpose-built centre near Shelley meets and exceeds the National Quality Framework (NQF), which means families can trust that every dimension of the centre -- the people, the spaces, the programs, and the partnerships -- is held to Australia's highest national standards for early education. We are proud of that commitment and live it every day.</w:t>
+        <w:t>Our purpose-built centre near Shelley meets and exceeds the National Quality Framework (NQF), which means families can trust that every dimension of the centre, the people, the spaces, the programs, and the partnerships, is held to Australia's highest national standards for early education. We are proud of that commitment and live it every day.</w:t>
         <w:br/>
         <w:br/>
         <w:t>We are open Monday to Friday, 7:00am to 6:00pm. Our parent communication app keeps families near Shelley genuinely connected throughout the day with real-time updates, photos, and observations from our educators.</w:t>
@@ -3015,7 +3021,7 @@
     </w:p>
     <w:p>
       <w:r>
-        <w:t>Flourish Early Learning Centre is a purpose-built childcare centre near Willetton where everything is designed around children having the very best start in life. Guided by the Early Years Learning Framework (EYLF) -- Belonging, Being and Becoming -- our programs are thoughtful, joyful, and genuinely focused on each child. Our qualified, passionate educators are what families near Willetton talk about most -- because great educators make everything else possible.</w:t>
+        <w:t>Flourish Early Learning Centre is a purpose-built childcare centre near Willetton where everything is designed around children having the very best start in life. Guided by the Early Years Learning Framework (EYLF): Belonging, Being and Becoming, our programs are thoughtful, joyful, and genuinely focused on each child. Our qualified, passionate educators are what families near Willetton talk about most, because great educators make everything else possible.</w:t>
       </w:r>
     </w:p>
     <w:p>
@@ -3044,7 +3050,7 @@
     </w:p>
     <w:p>
       <w:r>
-        <w:t>Our purpose-built centre near Willetton meets and exceeds the National Quality Framework (NQF). That standard means every area of our centre -- the learning environments, the educator qualifications, the programs, and the partnerships with families -- has been assessed against Australia's highest national benchmarks. We take genuine pride in the quality that represents.</w:t>
+        <w:t>Our purpose-built centre near Willetton meets and exceeds the National Quality Framework (NQF). That standard means every area of our centre, the learning environments, the educator qualifications, the programs, and the partnerships with families, has been assessed against Australia's highest national benchmarks. We take genuine pride in the quality that represents.</w:t>
         <w:br/>
         <w:br/>
         <w:t>We are open Monday to Friday, 7:00am to 6:00pm. Our parent communication app delivers real-time updates and photos throughout the day so families near Willetton always feel connected to their child's world.</w:t>
@@ -3172,7 +3178,7 @@
     </w:p>
     <w:p>
       <w:r>
-        <w:t>Flourish Early Learning Centre is a purpose-built early learning centre near Brentwood where families find something they often say is hard to describe but impossible to miss: the feeling that their child truly belongs here. Our programs are guided by the Early Years Learning Framework (EYLF) -- Belonging, Being and Becoming -- and our qualified, passionate educators bring that philosophy to life with warmth and expertise. Families near Brentwood choose Flourish ELC because it just feels right -- and the learning backs that feeling up.</w:t>
+        <w:t>Flourish Early Learning Centre is a purpose-built early learning centre near Brentwood where families find something they often say is hard to describe but impossible to miss: the feeling that their child truly belongs here. Our programs are guided by the Early Years Learning Framework (EYLF): Belonging, Being and Becoming, and our qualified, passionate educators bring that philosophy to life with warmth and expertise. Families near Brentwood choose Flourish ELC because it just feels right, and the learning backs that feeling up.</w:t>
       </w:r>
     </w:p>
     <w:p>
@@ -3201,7 +3207,7 @@
     </w:p>
     <w:p>
       <w:r>
-        <w:t>Our purpose-built centre near Brentwood meets and exceeds the National Quality Framework (NQF). Every element of the centre has been assessed against Australia's national quality standards -- and we hold ourselves to those standards because they matter to us, not just because they are required. That commitment is something Brentwood families feel and appreciate.</w:t>
+        <w:t>Our purpose-built centre near Brentwood meets and exceeds the National Quality Framework (NQF). Every element of the centre has been assessed against Australia's national quality standards, and we hold ourselves to those standards because they matter to us, not just because they are required. That commitment is something Brentwood families feel and appreciate.</w:t>
         <w:br/>
         <w:br/>
         <w:t>We are open Monday to Friday, 7:00am to 6:00pm. Our parent communication app keeps families near Brentwood connected throughout the day with real-time updates, photos, and observations from educators who genuinely care.</w:t>
@@ -3327,7 +3333,7 @@
     </w:p>
     <w:p>
       <w:r>
-        <w:t>Flourish Early Learning Centre offers a warm, EYLF-guided kindergarten program in Bull Creek where children are prepared for school in the best possible way: through joyful, intentional, play-based learning. Our Early Years Learning Framework -- Belonging, Being and Becoming -- is not just a concept here; it is the lived experience of every child in our care. Our qualified educators know each child well and create experiences that light them up. Kindergarten in Bull Creek is wonderful when it happens at Flourish ELC.</w:t>
+        <w:t>Flourish Early Learning Centre offers a warm, EYLF-guided kindergarten program in Bull Creek where children are prepared for school in the best possible way: through joyful, intentional, play-based learning. Our Early Years Learning Framework, Belonging, Being and Becoming, is not just a concept here; it is the lived experience of every child in our care. Our qualified educators know each child well and create experiences that light them up. Kindergarten in Bull Creek is wonderful when it happens at Flourish ELC.</w:t>
       </w:r>
     </w:p>
     <w:p>
@@ -3340,7 +3346,7 @@
     </w:p>
     <w:p>
       <w:r>
-        <w:t>Our kindergarten program in Bull Creek develops the skills children need across every area. Language, Mathematics, and Fine Motor Skills lay the academic groundwork for a smooth transition into primary school. STEM Learning, Creative Arts, and Music and Movement build the curiosity and creative thinking that make children love to learn. Cultural Understanding, Social Justice, Social and Emotional development, Independence, Exercise, and Health ensure that the whole child -- not just the student -- is nurtured and celebrated.</w:t>
+        <w:t>Our kindergarten program in Bull Creek develops the skills children need across every area. Language, Mathematics, and Fine Motor Skills lay the academic groundwork for a smooth transition into primary school. STEM Learning, Creative Arts, and Music and Movement build the curiosity and creative thinking that make children love to learn. Cultural Understanding, Social Justice, Social and Emotional development, Independence, Exercise, and Health ensure that the whole child, not just the student, is nurtured and celebrated.</w:t>
         <w:br/>
         <w:br/>
         <w:t>Five nutritious meals are served each weekday: breakfast, morning tea, lunch, afternoon tea, and a late snack. Our school readiness programs are the backbone of kindergarten at Flourish ELC, preparing children for primary school with confidence, resilience, and genuine excitement for the journey ahead.</w:t>
@@ -3359,7 +3365,7 @@
         <w:t>Our purpose-built centre in Bull Creek meets and exceeds the National Quality Framework (NQF). Our kindergarten educators hold recognised early childhood qualifications and bring both professional expertise and genuine warmth to every session. The spaces children learn in have been thoughtfully designed to support the kind of active, engaged kindergarten experience that produces lasting results.</w:t>
         <w:br/>
         <w:br/>
-        <w:t>We are open Monday to Friday, 7:00am to 6:00pm -- hours designed to give families flexibility. Our parent communication app sends real-time updates, photos, and milestones straight to your phone so you never miss a moment of your child's kindergarten year.</w:t>
+        <w:t>We are open Monday to Friday, 7:00am to 6:00pm, hours designed to give families flexibility. Our parent communication app sends real-time updates, photos, and milestones straight to your phone so you never miss a moment of your child's kindergarten year.</w:t>
       </w:r>
     </w:p>
     <w:p>
@@ -3482,7 +3488,7 @@
     </w:p>
     <w:p>
       <w:r>
-        <w:t>Flourish Early Learning Centre offers a warm, play-based kindergarten near Leeming guided by the Early Years Learning Framework (EYLF) -- Belonging, Being and Becoming. Our kindergarten year is one of the most important a child will have, and we take that responsibility joyfully and seriously. Our qualified educators design kindergarten experiences that build confident, curious, capable children who walk into primary school genuinely ready for everything that comes next. Families near Leeming trust us with that year, and we do not take it lightly.</w:t>
+        <w:t>Flourish Early Learning Centre offers a warm, play-based kindergarten near Leeming guided by the Early Years Learning Framework (EYLF): Belonging, Being and Becoming. Our kindergarten year is one of the most important a child will have, and we take that responsibility joyfully and seriously. Our qualified educators design kindergarten experiences that build confident, curious, capable children who walk into primary school genuinely ready for everything that comes next. Families near Leeming trust us with that year, and we do not take it lightly.</w:t>
       </w:r>
     </w:p>
     <w:p>
@@ -3495,7 +3501,7 @@
     </w:p>
     <w:p>
       <w:r>
-        <w:t>Our kindergarten curriculum near Leeming draws on all the learning areas that matter most in the year before school. Language, Mathematics, and Fine Motor Skills develop the academic foundations children need. STEM Learning and Creative Arts build the problem-solving and expressive skills that set children apart. Music and Movement, Cultural Understanding, Social Justice, Independence, Exercise, Health, and Social and Emotional development complete a kindergarten program that prepares children for school -- and for life.</w:t>
+        <w:t>Our kindergarten curriculum near Leeming draws on all the learning areas that matter most in the year before school. Language, Mathematics, and Fine Motor Skills develop the academic foundations children need. STEM Learning and Creative Arts build inventive thinking and the expressive skills that set children apart. Music and Movement, Cultural Understanding, Social Justice, Independence, Exercise, Health, and Social and Emotional development complete a kindergarten program that prepares children for school, and for life.</w:t>
         <w:br/>
         <w:br/>
         <w:t>Five nutritious meals are served fresh each weekday: breakfast, morning tea, lunch, afternoon tea, and a late snack. School readiness runs through everything we do in our kindergarten program, from the way we build literacy and numeracy skills to the way we develop independence and resilience in each child.</w:t>
@@ -3637,7 +3643,7 @@
     </w:p>
     <w:p>
       <w:r>
-        <w:t>Flourish Early Learning Centre offers a warm, EYLF-guided kindergarten program near Bateman where the year before primary school is spent in the very best way: learning through play, connecting with others, and growing into a confident, capable child. The Early Years Learning Framework -- Belonging, Being and Becoming -- shapes every experience in our kindergarten, and our qualified, passionate educators bring it to life with skill and joy. Families near Bateman choose Flourish ELC for their child's kindergarten year because they can see and feel the quality.</w:t>
+        <w:t>Flourish Early Learning Centre offers a warm, EYLF-guided kindergarten program near Bateman where the year before primary school is spent in the very best way: learning through play, connecting with others, and growing into a confident, capable child. The Early Years Learning Framework, Belonging, Being and Becoming, shapes every experience in our kindergarten, and our qualified, passionate educators bring it to life with skill and joy. Families near Bateman choose Flourish ELC for their child's kindergarten year because they can see and feel the quality.</w:t>
       </w:r>
     </w:p>
     <w:p>
@@ -3650,7 +3656,7 @@
     </w:p>
     <w:p>
       <w:r>
-        <w:t>Learning at Flourish ELC in the kindergarten year is comprehensive and joyful. Language, Mathematics, and Fine Motor Skills are developed through engaging, hands-on play. STEM Learning, Creative Arts, and Music and Movement make discovery genuinely exciting. Cultural Understanding, Social Justice, Social and Emotional development, Independence, Exercise, and Health ensure that every child is growing as a whole person -- not just building academic skills, but building character, confidence, and a real love of learning.</w:t>
+        <w:t>Learning at Flourish ELC in the kindergarten year is comprehensive and joyful. Language, Mathematics, and Fine Motor Skills are developed through engaging, hands-on play. STEM Learning, Creative Arts, and Music and Movement make discovery genuinely exciting. Cultural Understanding, Social Justice, Social and Emotional development, Independence, Exercise, and Health ensure that every child is growing as a whole person, not just building academic skills, but building character, confidence, and a real love of learning.</w:t>
         <w:br/>
         <w:br/>
         <w:t>Five nutritious meals are prepared and served each weekday: breakfast, morning tea, lunch, afternoon tea, and a late snack. School readiness is the golden thread running through our kindergarten curriculum, building everything children need to begin primary school feeling ready, excited, and completely capable.</w:t>
@@ -3792,7 +3798,7 @@
     </w:p>
     <w:p>
       <w:r>
-        <w:t>Flourish Early Learning Centre offers a warm, purpose-built kindergarten near Rossmoyne where children spend the year before school exactly as they should: playing, discovering, growing, and becoming. Our kindergarten programs are guided by the Early Years Learning Framework (EYLF) -- Belonging, Being and Becoming -- and delivered by qualified educators who genuinely love the kindergarten years. Families near Rossmoyne choose Flourish ELC because their children flourish here -- and because the transition to primary school that follows is confident and smooth.</w:t>
+        <w:t>Flourish Early Learning Centre offers a warm, purpose-built kindergarten near Rossmoyne where children spend the year before school exactly as they should: playing, discovering, growing, and becoming. Our kindergarten programs are guided by the Early Years Learning Framework (EYLF): Belonging, Being and Becoming, and delivered by qualified educators who genuinely love the kindergarten years. Families near Rossmoyne choose Flourish ELC because their children flourish here, and because the transition to primary school that follows is confident and smooth.</w:t>
       </w:r>
     </w:p>
     <w:p>
@@ -3845,7 +3851,7 @@
     </w:p>
     <w:p>
       <w:r>
-        <w:t>Our kindergarten program is designed for children aged 4 to 5 -- the year before primary school begins.</w:t>
+        <w:t>Our kindergarten program is designed for children aged 4 to 5, the year before primary school begins.</w:t>
       </w:r>
     </w:p>
     <w:p>
@@ -3947,7 +3953,7 @@
     </w:p>
     <w:p>
       <w:r>
-        <w:t>Flourish Early Learning Centre offers a warm, play-based kindergarten near Shelley guided by the Early Years Learning Framework (EYLF) -- Belonging, Being and Becoming. The year before primary school is one of the most important a child will have, and our qualified, passionate educators pour everything into making it wonderful. Children in our kindergarten near Shelley grow academically, socially, and emotionally -- and they do so in an environment that is safe, joyful, and genuinely child-centred. Families near Shelley choose Flourish ELC because what happens here sets children up for a lifetime.</w:t>
+        <w:t>Flourish Early Learning Centre offers a warm, play-based kindergarten near Shelley guided by the Early Years Learning Framework (EYLF): Belonging, Being and Becoming. The year before primary school is one of the most important a child will have, and our qualified, passionate educators pour everything into making it wonderful. Children in our kindergarten near Shelley grow academically, socially, and emotionally, and they do so in an environment that is safe, joyful, and genuinely child-centred. Families near Shelley choose Flourish ELC because what happens here sets children up for a lifetime.</w:t>
       </w:r>
     </w:p>
     <w:p>
@@ -3960,7 +3966,7 @@
     </w:p>
     <w:p>
       <w:r>
-        <w:t>Our kindergarten curriculum near Shelley is rich and intentional. Language, Mathematics, and Fine Motor Skills lay the academic foundations for primary school. STEM Learning and Creative Arts build the problem-solving and expressive skills that make children confident, inventive learners. Music and Movement, Cultural Understanding, Social Justice, Independence, Exercise, Health, and Social and Emotional development complete a kindergarten program that develops the whole child.</w:t>
+        <w:t>Our kindergarten curriculum near Shelley is rich and intentional. Language, Mathematics, and Fine Motor Skills lay the academic foundations for primary school. STEM Learning and Creative Arts build inventive thinking and expressive skills that make children confident, capable learners. Music and Movement, Cultural Understanding, Social Justice, Independence, Exercise, Health, and Social and Emotional development complete a kindergarten program that develops the whole child.</w:t>
         <w:br/>
         <w:br/>
         <w:t>Five nutritious meals are prepared and served each weekday: breakfast, morning tea, lunch, afternoon tea, and a late snack. School readiness is embedded in everything we do in the kindergarten year, building the skills and confidence children need to step into primary school ready to love it.</w:t>
@@ -4000,7 +4006,7 @@
     </w:p>
     <w:p>
       <w:r>
-        <w:t>Our kindergarten program serves children aged 4 to 5 -- the year before they begin primary school.</w:t>
+        <w:t>Our kindergarten program serves children aged 4 to 5, the year before they begin primary school.</w:t>
       </w:r>
     </w:p>
     <w:p>
@@ -4102,7 +4108,7 @@
     </w:p>
     <w:p>
       <w:r>
-        <w:t>Flourish Early Learning Centre offers a wonderful kindergarten near Willetton where children spend the year before primary school growing in every direction. Our kindergarten programs are guided by the Early Years Learning Framework (EYLF) -- Belonging, Being and Becoming -- and delivered by qualified, passionate educators who make every day count. Families near Willetton choose our kindergarten because they see the quality in the detail: the care, the curriculum, the community, and the children who thrive here.</w:t>
+        <w:t>Flourish Early Learning Centre offers a wonderful kindergarten near Willetton where children spend the year before primary school growing in every direction. Our kindergarten programs are guided by the Early Years Learning Framework (EYLF): Belonging, Being and Becoming, and delivered by qualified, passionate educators who make every day count. Families near Willetton choose our kindergarten because they see the quality in the detail: the care, the curriculum, the community, and the children who thrive here.</w:t>
       </w:r>
     </w:p>
     <w:p>
@@ -4115,7 +4121,7 @@
     </w:p>
     <w:p>
       <w:r>
-        <w:t>Learning at Flourish ELC in the kindergarten year is comprehensive, connected, and full of life. Language, Mathematics, and Fine Motor Skills develop the academic skills children carry into primary school. STEM Learning, Creative Arts, and Music and Movement make discovery genuinely joyful. Cultural Understanding, Social Justice, Social and Emotional development, Independence, Exercise, and Health ensure children are growing as whole people -- confident, curious, and ready for whatever comes next.</w:t>
+        <w:t>Learning at Flourish ELC in the kindergarten year is comprehensive, connected, and full of life. Language, Mathematics, and Fine Motor Skills develop the academic skills children carry into primary school. STEM Learning, Creative Arts, and Music and Movement make discovery genuinely joyful. Cultural Understanding, Social Justice, Social and Emotional development, Independence, Exercise, and Health ensure children are growing as whole people, confident, curious, and ready for whatever comes next.</w:t>
         <w:br/>
         <w:br/>
         <w:t>Five nutritious meals are served fresh each weekday: breakfast, morning tea, lunch, afternoon tea, and a late snack. School readiness is at the heart of our kindergarten curriculum, building everything children need to walk into their first day of primary school with a big smile and genuine capability.</w:t>
@@ -4257,7 +4263,7 @@
     </w:p>
     <w:p>
       <w:r>
-        <w:t>Flourish Early Learning Centre offers a warm, purpose-built kindergarten near Brentwood where the year before primary school is spent exactly as it should be: playing, learning, growing, and belonging. Guided by the Early Years Learning Framework (EYLF) -- Belonging, Being and Becoming -- our kindergarten programs are shaped around each child's unique journey. Our qualified, passionate educators bring both skill and genuine heart to every kindergarten session. Families near Brentwood trust us with the kindergarten year because they see, from day one, that their child is in wonderful hands.</w:t>
+        <w:t>Flourish Early Learning Centre offers a warm, purpose-built kindergarten near Brentwood where the year before primary school is spent exactly as it should be: playing, learning, growing, and belonging. Guided by the Early Years Learning Framework (EYLF): Belonging, Being and Becoming, our kindergarten programs are shaped around each child's unique journey. Our qualified, passionate educators bring both skill and genuine heart to every kindergarten session. Families near Brentwood trust us with the kindergarten year because they see, from day one, that their child is in wonderful hands.</w:t>
       </w:r>
     </w:p>
     <w:p>
@@ -4270,7 +4276,7 @@
     </w:p>
     <w:p>
       <w:r>
-        <w:t>Our kindergarten near Brentwood is built around the learning areas that matter most in the year before school. Language, Mathematics, and Fine Motor Skills develop the academic foundations children take into primary school. STEM Learning, Creative Arts, and Music and Movement make kindergarten genuinely exciting. Cultural Understanding, Social Justice, Independence, Exercise, Health, and Social and Emotional development ensure that every child is growing -- not just academically, but as a whole, confident, curious person.</w:t>
+        <w:t>Our kindergarten near Brentwood is built around the learning areas that matter most in the year before school. Language, Mathematics, and Fine Motor Skills develop the academic foundations children take into primary school. STEM Learning, Creative Arts, and Music and Movement make kindergarten genuinely exciting. Cultural Understanding, Social Justice, Independence, Exercise, Health, and Social and Emotional development ensure that every child is growing, not just academically, but as a whole, confident, curious person.</w:t>
         <w:br/>
         <w:br/>
         <w:t>Five nutritious meals are prepared and served each weekday: breakfast, morning tea, lunch, afternoon tea, and a late snack. School readiness is woven through every part of our kindergarten curriculum, building the literacy, numeracy, social, and emotional skills children need to begin primary school feeling ready and genuinely excited.</w:t>
@@ -4310,7 +4316,7 @@
     </w:p>
     <w:p>
       <w:r>
-        <w:t>Our kindergarten program is designed for children aged 4 to 5 -- the year before they begin primary school.</w:t>
+        <w:t>Our kindergarten program is designed for children aged 4 to 5, the year before they begin primary school.</w:t>
       </w:r>
     </w:p>
     <w:p>
@@ -4414,7 +4420,7 @@
     </w:p>
     <w:p>
       <w:r>
-        <w:t>Whatever brought you to searching for childcare near me -- a new baby, a house move, or simply the feeling that it is time -- you have come to the right place. Flourish Early Learning Centre is a family of purpose-built early learning centres guided by the Early Years Learning Framework (EYLF): Belonging, Being and Becoming. Our qualified, passionate educators create environments where children feel at home, families feel supported, and learning feels like the joyful adventure it is meant to be.</w:t>
+        <w:t>Whatever brought you to searching for childcare near me, a new baby, a house move, or simply the feeling that it is time, you have come to the right place. Flourish Early Learning Centre is a family of purpose-built early learning centres guided by the Early Years Learning Framework (EYLF): Belonging, Being and Becoming. Our qualified, passionate educators create environments where children feel at home, families feel supported, and learning feels like the joyful adventure it is meant to be.</w:t>
       </w:r>
     </w:p>
     <w:p>
@@ -4427,7 +4433,7 @@
     </w:p>
     <w:p>
       <w:r>
-        <w:t>Every Flourish ELC centre -- whether you are searching for childcare, daycare, preschool, or kindergarten near you -- is built around the same beautiful principles. Our programs cover Creative Arts, STEM Learning, Language, Mathematics, Fine Motor Skills, Music and Movement, Cultural Understanding, Social Justice, Independence, Exercise, Health, and Social and Emotional development. These are not just learning areas; they are the threads of a rich, whole-child experience that children and families love.</w:t>
+        <w:t>Every Flourish ELC centre, whether you are searching for childcare, daycare, preschool, or kindergarten near you, is built around the same beautiful principles. Our programs cover Creative Arts, STEM Learning, Language, Mathematics, Fine Motor Skills, Music and Movement, Cultural Understanding, Social Justice, Independence, Exercise, Health, and Social and Emotional development. These are not just learning areas; they are the threads of a rich, whole-child experience that children and families love.</w:t>
         <w:br/>
         <w:br/>
         <w:t>Five nutritious meals are served fresh every weekday: breakfast, morning tea, lunch, afternoon tea, and a late snack. Our centres are open 7:00am to 6:00pm Monday to Friday. Our parent communication app keeps every family connected with real-time updates and photos throughout the day. School readiness programs are woven through our curriculum so that children transition to kindergarten and primary school with confidence, capability, and enthusiasm.</w:t>
@@ -4443,7 +4449,7 @@
     </w:p>
     <w:p>
       <w:r>
-        <w:t>Every Flourish ELC centre is staffed by qualified educators who meet and exceed the National Quality Framework (NQF). Our facilities are purpose-built for children from 6 weeks to school age -- not repurposed spaces, but environments designed from the ground up around how young children learn, rest, play, and grow. Families searching for preschool or kindergarten near me will find that same consistent standard across every Flourish ELC location.</w:t>
+        <w:t>Every Flourish ELC centre is staffed by qualified educators who meet and exceed the National Quality Framework (NQF). Our facilities are purpose-built for children from 6 weeks to school age, not repurposed spaces, but environments designed from the ground up around how young children learn, rest, play, and grow. Families searching for preschool or kindergarten near me will find that same consistent standard across every Flourish ELC location.</w:t>
         <w:br/>
         <w:br/>
         <w:t>Our parent communication app is one of the things families love most. It delivers real-time photos, updates, and observations throughout the day so even when you are at work, you are never far from your child's world. It is a small but meaningful reflection of how much we value the partnership between families and educators.</w:t>
@@ -4519,7 +4525,7 @@
     </w:p>
     <w:p>
       <w:r>
-        <w:t>The Early Years Learning Framework guides how our educators plan, observe, and respond to each child -- always with belonging, wellbeing, and engagement at the heart of practice. It is the foundation of everything we do.</w:t>
+        <w:t>The Early Years Learning Framework guides how our educators plan, observe, and respond to each child, always with belonging, wellbeing, and engagement at the heart of practice. It is the foundation of everything we do.</w:t>
       </w:r>
     </w:p>
     <w:p>

</xml_diff>